<commit_message>
feat(loan-document): auto-fill ATM Card No./Account No./Branch on Deed of Assignment
User request: the ATM Card No./Passbook No., Savings Account No., and
Branch blanks on both Deed of Assignment - Borrower and Deed of
Assignment - Co-Borrower were blank. Added {ATMCardNumber}/
{AccountNumber}/{Branch} merge tags to both templates' "ATM Card No. /
Passbook No. ___ covered by Savings Account No. ___ opened/deposited
at ___ Branch." sentence - no backend changes needed, these merge
fields were already wired into LoanDocumentMergeDataResolver for the
Quit Claim auto-fill work (same source: the loan's LoanApplication
mitigation data).

Verified end-to-end against a real loan (SML-DELUXE) for both
templates via the actual GenerateLoanDocumentUseCase, and visually via
LibreOffice PDF render (correct spacing around each inserted value,
nothing clipped, still fits on the original single page).

Co-Authored-By: Claude Sonnet 5 <noreply@anthropic.com>
</commit_message>
<xml_diff>
--- a/app/easycashbackend/templates/DEED_OF_ASSIGNMENT_BORROWER.docx
+++ b/app/easycashbackend/templates/DEED_OF_ASSIGNMENT_BORROWER.docx
@@ -666,7 +666,7 @@
           <w:sz w:val="15"/>
           <w:szCs w:val="15"/>
         </w:rPr>
-        <w:t xml:space="preserve"> </w:t>
+        <w:t xml:space="preserve"> {ATMCardNumber} </w:t>
       </w:r>
       <w:r>
         <w:rPr>
@@ -683,7 +683,7 @@
           <w:sz w:val="15"/>
           <w:szCs w:val="15"/>
         </w:rPr>
-        <w:t xml:space="preserve"> </w:t>
+        <w:t xml:space="preserve"> {AccountNumber} </w:t>
       </w:r>
       <w:r>
         <w:rPr>
@@ -700,7 +700,7 @@
           <w:sz w:val="15"/>
           <w:szCs w:val="15"/>
         </w:rPr>
-        <w:t xml:space="preserve">  </w:t>
+        <w:t xml:space="preserve"> {Branch} </w:t>
       </w:r>
       <w:r>
         <w:rPr>

</xml_diff>